<commit_message>
feat: full accredited LO wording on the Learning Outcomes slide and regenerated activity overview slides (v4.14)
- Learning Outcomes slide now carries the full accredited LO1-LO3 wording
- Activity overview slides for Activities 1, 4, 6, 7 and 8 regenerated with
  activity-specific step flows and 'You'll produce' lines matching the
  activity packs and Learner Guide
- Thank You slide layout corrected; activity PDFs re-stamped; deck v414,
  LP/LG regenerated with 4.14 version-control entries; v413 archived

Co-Authored-By: Claude Fable 5 <noreply@anthropic.com>
</commit_message>
<xml_diff>
--- a/courseware/Lesson Plan - TGS-2025060473 - AI Security for Autonomous AI Agents.docx
+++ b/courseware/Lesson Plan - TGS-2025060473 - AI Security for Autonomous AI Agents.docx
@@ -179,7 +179,7 @@
           <w:color w:val="1F6FEB"/>
           <w:sz w:val="24"/>
         </w:rPr>
-        <w:t>Version 4.13</w:t>
+        <w:t>Version 4.14</w:t>
       </w:r>
     </w:p>
     <w:p>
@@ -1309,6 +1309,64 @@
                 <w:sz w:val="19"/>
               </w:rPr>
               <w:t>Practical instrument renamed from Practical Performance to Case Study across the assessment set, slides, Lesson Plan and Learner Guide. Each Case Study task trimmed to TWO questions: Task 1 keeps the generative-vs-agentic-vs-agent and useful-vs-not-trusted questions; Task 2 keeps the weak-vs-strong prompt and prompt-principles questions; Task 3 keeps the leaky-vs-guarded chatbot and accountability questions. Marks rebalanced (20/24/26, total 70). Schedule timing and TSC K/A text unchanged.</w:t>
+            </w:r>
+          </w:p>
+        </w:tc>
+        <w:tc>
+          <w:tcPr>
+            <w:tcW w:type="dxa" w:w="2160"/>
+          </w:tcPr>
+          <w:p>
+            <w:r/>
+            <w:r>
+              <w:rPr>
+                <w:sz w:val="19"/>
+              </w:rPr>
+              <w:t>Dr Alfred Ang</w:t>
+            </w:r>
+          </w:p>
+        </w:tc>
+      </w:tr>
+      <w:tr>
+        <w:tc>
+          <w:tcPr>
+            <w:tcW w:type="dxa" w:w="2160"/>
+          </w:tcPr>
+          <w:p>
+            <w:r/>
+            <w:r>
+              <w:rPr>
+                <w:sz w:val="19"/>
+              </w:rPr>
+              <w:t>4.14</w:t>
+            </w:r>
+          </w:p>
+        </w:tc>
+        <w:tc>
+          <w:tcPr>
+            <w:tcW w:type="dxa" w:w="2160"/>
+          </w:tcPr>
+          <w:p>
+            <w:r/>
+            <w:r>
+              <w:rPr>
+                <w:sz w:val="19"/>
+              </w:rPr>
+              <w:t>26 August 2026</w:t>
+            </w:r>
+          </w:p>
+        </w:tc>
+        <w:tc>
+          <w:tcPr>
+            <w:tcW w:type="dxa" w:w="2160"/>
+          </w:tcPr>
+          <w:p>
+            <w:r/>
+            <w:r>
+              <w:rPr>
+                <w:sz w:val="19"/>
+              </w:rPr>
+              <w:t>Learning Outcomes slide now carries the full accredited LO1-LO3 wording. Activity overview slides for Activities 1, 4, 6, 7 and 8 regenerated with activity-specific step flows and 'You'll produce' lines matching the activity packs and Learner Guide. Thank You slide layout corrected. Activity PDFs re-stamped to the current version. Schedule timing and TSC K/A text unchanged.</w:t>
             </w:r>
           </w:p>
         </w:tc>

</xml_diff>

<commit_message>
docs: align Lesson Plan slide numbers to the 168-slide deck (v4.16)
The LP claimed 'Slides 1-165' and gave no per-session slide references, so a
trainer could not map the schedule onto the current deck.

- Correct the deck total to 168
- Add a Slides column to the one-day schedule with the exact deck range for
  every session; all 168 slides are covered with no gaps or overlaps, and
  each range boundary lands on the matching section divider in the deck
- Rebalance the schedule column widths so the table fits the page
- Fix the 4:35-5:15 row rendering at the wrong font size
- LP/LG bumped to v4.16 with a Document Version Control Record row

Co-Authored-By: Claude Opus 5 (1M context) <noreply@anthropic.com>
</commit_message>
<xml_diff>
--- a/courseware/Lesson Plan - TGS-2025060473 - AI Security for Autonomous AI Agents.docx
+++ b/courseware/Lesson Plan - TGS-2025060473 - AI Security for Autonomous AI Agents.docx
@@ -179,7 +179,7 @@
           <w:color w:val="1F6FEB"/>
           <w:sz w:val="24"/>
         </w:rPr>
-        <w:t>Version 4.15</w:t>
+        <w:t>Version 4.16</w:t>
       </w:r>
     </w:p>
     <w:p>
@@ -1423,6 +1423,68 @@
           <w:p>
             <w:r>
               <w:t>Learner Guide and Lesson Plan realigned to the v4.15 deck: Topic 3 job redesign restructured into a narrative sequence (Why Now, The Stakes, Our Operating Model, The Problem, The Solution, The Intervention, The Product, The Worked Example), all slide references renumbered to the 168-slide deck, and Activity 6 extended with the six simulator personas and the A6-Coaching-Sarah worked transcript.</w:t>
+            </w:r>
+            <w:r>
+              <w:rPr>
+                <w:sz w:val="19"/>
+              </w:rPr>
+            </w:r>
+          </w:p>
+        </w:tc>
+        <w:tc>
+          <w:tcPr>
+            <w:tcW w:type="dxa" w:w="2160"/>
+          </w:tcPr>
+          <w:p>
+            <w:r>
+              <w:t>Dr Alfred Ang</w:t>
+            </w:r>
+            <w:r>
+              <w:rPr>
+                <w:sz w:val="19"/>
+              </w:rPr>
+            </w:r>
+          </w:p>
+        </w:tc>
+      </w:tr>
+      <w:tr>
+        <w:tc>
+          <w:tcPr>
+            <w:tcW w:type="dxa" w:w="2160"/>
+          </w:tcPr>
+          <w:p>
+            <w:r>
+              <w:t>4.16</w:t>
+            </w:r>
+            <w:r>
+              <w:rPr>
+                <w:sz w:val="19"/>
+              </w:rPr>
+            </w:r>
+          </w:p>
+        </w:tc>
+        <w:tc>
+          <w:tcPr>
+            <w:tcW w:type="dxa" w:w="2160"/>
+          </w:tcPr>
+          <w:p>
+            <w:r>
+              <w:t>26 August 2026</w:t>
+            </w:r>
+            <w:r>
+              <w:rPr>
+                <w:sz w:val="19"/>
+              </w:rPr>
+            </w:r>
+          </w:p>
+        </w:tc>
+        <w:tc>
+          <w:tcPr>
+            <w:tcW w:type="dxa" w:w="2160"/>
+          </w:tcPr>
+          <w:p>
+            <w:r>
+              <w:t>Lesson Plan slide references aligned to the 168-slide v4.14 deck: the deck total corrected from 165 to 168, and a Slides column added to the one-day schedule giving the exact deck range for every session (all 168 slides covered, no gaps or overlaps).</w:t>
             </w:r>
             <w:r>
               <w:rPr>
@@ -2716,7 +2778,7 @@
           <w:color w:val="555B66"/>
           <w:sz w:val="19"/>
         </w:rPr>
-        <w:t>Slides 1–165 of the trainer deck.</w:t>
+        <w:t>Slides 1–168 of the trainer deck. The Slides column below gives the deck range for each session.</w:t>
       </w:r>
     </w:p>
     <w:tbl>
@@ -2724,11 +2786,13 @@
         <w:tblStyle w:val="TableGrid"/>
         <w:tblW w:type="auto" w:w="0"/>
         <w:tblLook w:firstColumn="1" w:firstRow="1" w:lastColumn="0" w:lastRow="0" w:noHBand="0" w:noVBand="1" w:val="04A0"/>
+        <w:tblLayout w:type="fixed"/>
       </w:tblPr>
       <w:tblGrid>
-        <w:gridCol w:w="2880"/>
-        <w:gridCol w:w="2880"/>
-        <w:gridCol w:w="2880"/>
+        <w:gridCol w:w="1399"/>
+        <w:gridCol w:w="4921"/>
+        <w:gridCol w:w="1219"/>
+        <w:gridCol w:w="1489"/>
       </w:tblGrid>
       <w:tr>
         <w:trPr>
@@ -2736,7 +2800,7 @@
         </w:trPr>
         <w:tc>
           <w:tcPr>
-            <w:tcW w:type="dxa" w:w="1656"/>
+            <w:tcW w:type="dxa" w:w="1400"/>
             <w:shd w:val="clear" w:color="auto" w:fill="1F6FEB"/>
           </w:tcPr>
           <w:p>
@@ -2757,7 +2821,7 @@
         </w:tc>
         <w:tc>
           <w:tcPr>
-            <w:tcW w:type="dxa" w:w="7416"/>
+            <w:tcW w:type="dxa" w:w="4921"/>
             <w:shd w:val="clear" w:color="auto" w:fill="1F6FEB"/>
           </w:tcPr>
           <w:p>
@@ -2778,7 +2842,7 @@
         </w:tc>
         <w:tc>
           <w:tcPr>
-            <w:tcW w:type="dxa" w:w="1224"/>
+            <w:tcW w:type="dxa" w:w="1219"/>
             <w:shd w:val="clear" w:color="auto" w:fill="1F6FEB"/>
           </w:tcPr>
           <w:p>
@@ -2794,6 +2858,28 @@
                 <w:sz w:val="20"/>
               </w:rPr>
               <w:t>Duration</w:t>
+            </w:r>
+          </w:p>
+        </w:tc>
+        <w:tc>
+          <w:tcPr>
+            <w:tcW w:type="dxa" w:w="1490"/>
+            <w:shd w:val="clear" w:color="auto" w:fill="1F6FEB"/>
+          </w:tcPr>
+          <w:p>
+            <w:pPr>
+              <w:keepLines/>
+            </w:pPr>
+            <w:r>
+              <w:t>Slides</w:t>
+            </w:r>
+            <w:r>
+              <w:rPr>
+                <w:rFonts w:ascii="Arial" w:hAnsi="Arial"/>
+                <w:b/>
+                <w:color w:val="FFFFFF"/>
+                <w:sz w:val="20"/>
+              </w:rPr>
             </w:r>
           </w:p>
         </w:tc>
@@ -2804,7 +2890,7 @@
         </w:trPr>
         <w:tc>
           <w:tcPr>
-            <w:tcW w:type="dxa" w:w="1656"/>
+            <w:tcW w:type="dxa" w:w="1400"/>
             <w:shd w:val="clear" w:color="auto" w:fill="F2F4F7"/>
           </w:tcPr>
           <w:p>
@@ -2824,7 +2910,7 @@
         </w:tc>
         <w:tc>
           <w:tcPr>
-            <w:tcW w:type="dxa" w:w="7416"/>
+            <w:tcW w:type="dxa" w:w="4921"/>
             <w:shd w:val="clear" w:color="auto" w:fill="F2F4F7"/>
           </w:tcPr>
           <w:p>
@@ -2844,7 +2930,7 @@
         </w:tc>
         <w:tc>
           <w:tcPr>
-            <w:tcW w:type="dxa" w:w="1224"/>
+            <w:tcW w:type="dxa" w:w="1219"/>
             <w:shd w:val="clear" w:color="auto" w:fill="F2F4F7"/>
           </w:tcPr>
           <w:p>
@@ -2859,6 +2945,27 @@
                 <w:sz w:val="19"/>
               </w:rPr>
               <w:t>20 min</w:t>
+            </w:r>
+          </w:p>
+        </w:tc>
+        <w:tc>
+          <w:tcPr>
+            <w:tcW w:type="dxa" w:w="1490"/>
+            <w:shd w:val="clear" w:color="auto" w:fill="F2F4F7"/>
+          </w:tcPr>
+          <w:p>
+            <w:pPr>
+              <w:keepLines/>
+            </w:pPr>
+            <w:r>
+              <w:t>1–11</w:t>
+            </w:r>
+            <w:r>
+              <w:rPr>
+                <w:rFonts w:ascii="Arial" w:hAnsi="Arial"/>
+                <w:b w:val="0"/>
+                <w:sz w:val="19"/>
+              </w:rPr>
             </w:r>
           </w:p>
         </w:tc>
@@ -2869,7 +2976,7 @@
         </w:trPr>
         <w:tc>
           <w:tcPr>
-            <w:tcW w:type="dxa" w:w="1656"/>
+            <w:tcW w:type="dxa" w:w="1400"/>
             <w:shd w:val="clear" w:color="auto" w:fill="E8F0FE"/>
           </w:tcPr>
           <w:p>
@@ -2889,7 +2996,7 @@
         </w:tc>
         <w:tc>
           <w:tcPr>
-            <w:tcW w:type="dxa" w:w="7416"/>
+            <w:tcW w:type="dxa" w:w="4921"/>
             <w:shd w:val="clear" w:color="auto" w:fill="E8F0FE"/>
           </w:tcPr>
           <w:p>
@@ -2909,7 +3016,7 @@
         </w:tc>
         <w:tc>
           <w:tcPr>
-            <w:tcW w:type="dxa" w:w="1224"/>
+            <w:tcW w:type="dxa" w:w="1219"/>
             <w:shd w:val="clear" w:color="auto" w:fill="E8F0FE"/>
           </w:tcPr>
           <w:p>
@@ -2924,6 +3031,27 @@
                 <w:sz w:val="19"/>
               </w:rPr>
               <w:t>45 min</w:t>
+            </w:r>
+          </w:p>
+        </w:tc>
+        <w:tc>
+          <w:tcPr>
+            <w:tcW w:type="dxa" w:w="1490"/>
+            <w:shd w:val="clear" w:color="auto" w:fill="E8F0FE"/>
+          </w:tcPr>
+          <w:p>
+            <w:pPr>
+              <w:keepLines/>
+            </w:pPr>
+            <w:r>
+              <w:t>12–26</w:t>
+            </w:r>
+            <w:r>
+              <w:rPr>
+                <w:rFonts w:ascii="Arial" w:hAnsi="Arial"/>
+                <w:b w:val="0"/>
+                <w:sz w:val="19"/>
+              </w:rPr>
             </w:r>
           </w:p>
         </w:tc>
@@ -2934,7 +3062,7 @@
         </w:trPr>
         <w:tc>
           <w:tcPr>
-            <w:tcW w:type="dxa" w:w="1656"/>
+            <w:tcW w:type="dxa" w:w="1400"/>
             <w:shd w:val="clear" w:color="auto" w:fill="E8F0FE"/>
           </w:tcPr>
           <w:p>
@@ -2954,7 +3082,7 @@
         </w:tc>
         <w:tc>
           <w:tcPr>
-            <w:tcW w:type="dxa" w:w="7416"/>
+            <w:tcW w:type="dxa" w:w="4921"/>
             <w:shd w:val="clear" w:color="auto" w:fill="E8F0FE"/>
           </w:tcPr>
           <w:p>
@@ -2974,7 +3102,7 @@
         </w:tc>
         <w:tc>
           <w:tcPr>
-            <w:tcW w:type="dxa" w:w="1224"/>
+            <w:tcW w:type="dxa" w:w="1219"/>
             <w:shd w:val="clear" w:color="auto" w:fill="E8F0FE"/>
           </w:tcPr>
           <w:p>
@@ -2989,6 +3117,27 @@
                 <w:sz w:val="19"/>
               </w:rPr>
               <w:t>40 min</w:t>
+            </w:r>
+          </w:p>
+        </w:tc>
+        <w:tc>
+          <w:tcPr>
+            <w:tcW w:type="dxa" w:w="1490"/>
+            <w:shd w:val="clear" w:color="auto" w:fill="E8F0FE"/>
+          </w:tcPr>
+          <w:p>
+            <w:pPr>
+              <w:keepLines/>
+            </w:pPr>
+            <w:r>
+              <w:t>27–38</w:t>
+            </w:r>
+            <w:r>
+              <w:rPr>
+                <w:rFonts w:ascii="Arial" w:hAnsi="Arial"/>
+                <w:b w:val="0"/>
+                <w:sz w:val="19"/>
+              </w:rPr>
             </w:r>
           </w:p>
         </w:tc>
@@ -2999,7 +3148,7 @@
         </w:trPr>
         <w:tc>
           <w:tcPr>
-            <w:tcW w:type="dxa" w:w="1656"/>
+            <w:tcW w:type="dxa" w:w="1400"/>
             <w:shd w:val="clear" w:color="auto" w:fill="FDF3E3"/>
           </w:tcPr>
           <w:p>
@@ -3019,7 +3168,7 @@
         </w:tc>
         <w:tc>
           <w:tcPr>
-            <w:tcW w:type="dxa" w:w="7416"/>
+            <w:tcW w:type="dxa" w:w="4921"/>
             <w:shd w:val="clear" w:color="auto" w:fill="FDF3E3"/>
           </w:tcPr>
           <w:p>
@@ -3039,7 +3188,7 @@
         </w:tc>
         <w:tc>
           <w:tcPr>
-            <w:tcW w:type="dxa" w:w="1224"/>
+            <w:tcW w:type="dxa" w:w="1219"/>
             <w:shd w:val="clear" w:color="auto" w:fill="FDF3E3"/>
           </w:tcPr>
           <w:p>
@@ -3054,6 +3203,27 @@
                 <w:sz w:val="19"/>
               </w:rPr>
               <w:t>15 min</w:t>
+            </w:r>
+          </w:p>
+        </w:tc>
+        <w:tc>
+          <w:tcPr>
+            <w:tcW w:type="dxa" w:w="1490"/>
+            <w:shd w:val="clear" w:color="auto" w:fill="FDF3E3"/>
+          </w:tcPr>
+          <w:p>
+            <w:pPr>
+              <w:keepLines/>
+            </w:pPr>
+            <w:r>
+              <w:t>—</w:t>
+            </w:r>
+            <w:r>
+              <w:rPr>
+                <w:rFonts w:ascii="Arial" w:hAnsi="Arial"/>
+                <w:b w:val="0"/>
+                <w:sz w:val="19"/>
+              </w:rPr>
             </w:r>
           </w:p>
         </w:tc>
@@ -3064,7 +3234,7 @@
         </w:trPr>
         <w:tc>
           <w:tcPr>
-            <w:tcW w:type="dxa" w:w="1656"/>
+            <w:tcW w:type="dxa" w:w="1400"/>
             <w:shd w:val="clear" w:color="auto" w:fill="E8F0FE"/>
           </w:tcPr>
           <w:p>
@@ -3084,7 +3254,7 @@
         </w:tc>
         <w:tc>
           <w:tcPr>
-            <w:tcW w:type="dxa" w:w="7416"/>
+            <w:tcW w:type="dxa" w:w="4921"/>
             <w:shd w:val="clear" w:color="auto" w:fill="E8F0FE"/>
           </w:tcPr>
           <w:p>
@@ -3104,7 +3274,7 @@
         </w:tc>
         <w:tc>
           <w:tcPr>
-            <w:tcW w:type="dxa" w:w="1224"/>
+            <w:tcW w:type="dxa" w:w="1219"/>
             <w:shd w:val="clear" w:color="auto" w:fill="E8F0FE"/>
           </w:tcPr>
           <w:p>
@@ -3119,6 +3289,27 @@
                 <w:sz w:val="19"/>
               </w:rPr>
               <w:t>45 min</w:t>
+            </w:r>
+          </w:p>
+        </w:tc>
+        <w:tc>
+          <w:tcPr>
+            <w:tcW w:type="dxa" w:w="1490"/>
+            <w:shd w:val="clear" w:color="auto" w:fill="E8F0FE"/>
+          </w:tcPr>
+          <w:p>
+            <w:pPr>
+              <w:keepLines/>
+            </w:pPr>
+            <w:r>
+              <w:t>39–70</w:t>
+            </w:r>
+            <w:r>
+              <w:rPr>
+                <w:rFonts w:ascii="Arial" w:hAnsi="Arial"/>
+                <w:b w:val="0"/>
+                <w:sz w:val="19"/>
+              </w:rPr>
             </w:r>
           </w:p>
         </w:tc>
@@ -3129,7 +3320,7 @@
         </w:trPr>
         <w:tc>
           <w:tcPr>
-            <w:tcW w:type="dxa" w:w="1656"/>
+            <w:tcW w:type="dxa" w:w="1400"/>
             <w:shd w:val="clear" w:color="auto" w:fill="E6F7F1"/>
           </w:tcPr>
           <w:p>
@@ -3149,7 +3340,7 @@
         </w:tc>
         <w:tc>
           <w:tcPr>
-            <w:tcW w:type="dxa" w:w="7416"/>
+            <w:tcW w:type="dxa" w:w="4921"/>
             <w:shd w:val="clear" w:color="auto" w:fill="E6F7F1"/>
           </w:tcPr>
           <w:p>
@@ -3169,7 +3360,7 @@
         </w:tc>
         <w:tc>
           <w:tcPr>
-            <w:tcW w:type="dxa" w:w="1224"/>
+            <w:tcW w:type="dxa" w:w="1219"/>
             <w:shd w:val="clear" w:color="auto" w:fill="E6F7F1"/>
           </w:tcPr>
           <w:p>
@@ -3184,6 +3375,27 @@
                 <w:sz w:val="19"/>
               </w:rPr>
               <w:t>45 min</w:t>
+            </w:r>
+          </w:p>
+        </w:tc>
+        <w:tc>
+          <w:tcPr>
+            <w:tcW w:type="dxa" w:w="1490"/>
+            <w:shd w:val="clear" w:color="auto" w:fill="E6F7F1"/>
+          </w:tcPr>
+          <w:p>
+            <w:pPr>
+              <w:keepLines/>
+            </w:pPr>
+            <w:r>
+              <w:t>75–77</w:t>
+            </w:r>
+            <w:r>
+              <w:rPr>
+                <w:rFonts w:ascii="Arial" w:hAnsi="Arial"/>
+                <w:b w:val="0"/>
+                <w:sz w:val="19"/>
+              </w:rPr>
             </w:r>
           </w:p>
         </w:tc>
@@ -3194,7 +3406,7 @@
         </w:trPr>
         <w:tc>
           <w:tcPr>
-            <w:tcW w:type="dxa" w:w="1656"/>
+            <w:tcW w:type="dxa" w:w="1400"/>
             <w:shd w:val="clear" w:color="auto" w:fill="FDF3E3"/>
           </w:tcPr>
           <w:p>
@@ -3214,7 +3426,7 @@
         </w:tc>
         <w:tc>
           <w:tcPr>
-            <w:tcW w:type="dxa" w:w="7416"/>
+            <w:tcW w:type="dxa" w:w="4921"/>
             <w:shd w:val="clear" w:color="auto" w:fill="FDF3E3"/>
           </w:tcPr>
           <w:p>
@@ -3234,7 +3446,7 @@
         </w:tc>
         <w:tc>
           <w:tcPr>
-            <w:tcW w:type="dxa" w:w="1224"/>
+            <w:tcW w:type="dxa" w:w="1219"/>
             <w:shd w:val="clear" w:color="auto" w:fill="FDF3E3"/>
           </w:tcPr>
           <w:p>
@@ -3249,6 +3461,27 @@
                 <w:sz w:val="19"/>
               </w:rPr>
               <w:t>60 min</w:t>
+            </w:r>
+          </w:p>
+        </w:tc>
+        <w:tc>
+          <w:tcPr>
+            <w:tcW w:type="dxa" w:w="1490"/>
+            <w:shd w:val="clear" w:color="auto" w:fill="FDF3E3"/>
+          </w:tcPr>
+          <w:p>
+            <w:pPr>
+              <w:keepLines/>
+            </w:pPr>
+            <w:r>
+              <w:t>—</w:t>
+            </w:r>
+            <w:r>
+              <w:rPr>
+                <w:rFonts w:ascii="Arial" w:hAnsi="Arial"/>
+                <w:b w:val="0"/>
+                <w:sz w:val="19"/>
+              </w:rPr>
             </w:r>
           </w:p>
         </w:tc>
@@ -3259,7 +3492,7 @@
         </w:trPr>
         <w:tc>
           <w:tcPr>
-            <w:tcW w:type="dxa" w:w="1656"/>
+            <w:tcW w:type="dxa" w:w="1400"/>
             <w:shd w:val="clear" w:color="auto" w:fill="E8F0FE"/>
           </w:tcPr>
           <w:p>
@@ -3279,7 +3512,7 @@
         </w:tc>
         <w:tc>
           <w:tcPr>
-            <w:tcW w:type="dxa" w:w="7416"/>
+            <w:tcW w:type="dxa" w:w="4921"/>
             <w:shd w:val="clear" w:color="auto" w:fill="E8F0FE"/>
           </w:tcPr>
           <w:p>
@@ -3299,7 +3532,7 @@
         </w:tc>
         <w:tc>
           <w:tcPr>
-            <w:tcW w:type="dxa" w:w="1224"/>
+            <w:tcW w:type="dxa" w:w="1219"/>
             <w:shd w:val="clear" w:color="auto" w:fill="E8F0FE"/>
           </w:tcPr>
           <w:p>
@@ -3314,6 +3547,27 @@
                 <w:sz w:val="19"/>
               </w:rPr>
               <w:t>15 min</w:t>
+            </w:r>
+          </w:p>
+        </w:tc>
+        <w:tc>
+          <w:tcPr>
+            <w:tcW w:type="dxa" w:w="1490"/>
+            <w:shd w:val="clear" w:color="auto" w:fill="E8F0FE"/>
+          </w:tcPr>
+          <w:p>
+            <w:pPr>
+              <w:keepLines/>
+            </w:pPr>
+            <w:r>
+              <w:t>71–74</w:t>
+            </w:r>
+            <w:r>
+              <w:rPr>
+                <w:rFonts w:ascii="Arial" w:hAnsi="Arial"/>
+                <w:b w:val="0"/>
+                <w:sz w:val="19"/>
+              </w:rPr>
             </w:r>
           </w:p>
         </w:tc>
@@ -3324,7 +3578,7 @@
         </w:trPr>
         <w:tc>
           <w:tcPr>
-            <w:tcW w:type="dxa" w:w="1656"/>
+            <w:tcW w:type="dxa" w:w="1400"/>
             <w:shd w:val="clear" w:color="auto" w:fill="E8F0FE"/>
           </w:tcPr>
           <w:p>
@@ -3344,7 +3598,7 @@
         </w:tc>
         <w:tc>
           <w:tcPr>
-            <w:tcW w:type="dxa" w:w="7416"/>
+            <w:tcW w:type="dxa" w:w="4921"/>
             <w:shd w:val="clear" w:color="auto" w:fill="E8F0FE"/>
           </w:tcPr>
           <w:p>
@@ -3364,7 +3618,7 @@
         </w:tc>
         <w:tc>
           <w:tcPr>
-            <w:tcW w:type="dxa" w:w="1224"/>
+            <w:tcW w:type="dxa" w:w="1219"/>
             <w:shd w:val="clear" w:color="auto" w:fill="E8F0FE"/>
           </w:tcPr>
           <w:p>
@@ -3379,6 +3633,27 @@
                 <w:sz w:val="19"/>
               </w:rPr>
               <w:t>35 min</w:t>
+            </w:r>
+          </w:p>
+        </w:tc>
+        <w:tc>
+          <w:tcPr>
+            <w:tcW w:type="dxa" w:w="1490"/>
+            <w:shd w:val="clear" w:color="auto" w:fill="E8F0FE"/>
+          </w:tcPr>
+          <w:p>
+            <w:pPr>
+              <w:keepLines/>
+            </w:pPr>
+            <w:r>
+              <w:t>78–90</w:t>
+            </w:r>
+            <w:r>
+              <w:rPr>
+                <w:rFonts w:ascii="Arial" w:hAnsi="Arial"/>
+                <w:b w:val="0"/>
+                <w:sz w:val="19"/>
+              </w:rPr>
             </w:r>
           </w:p>
         </w:tc>
@@ -3389,7 +3664,7 @@
         </w:trPr>
         <w:tc>
           <w:tcPr>
-            <w:tcW w:type="dxa" w:w="1656"/>
+            <w:tcW w:type="dxa" w:w="1400"/>
             <w:shd w:val="clear" w:color="auto" w:fill="E6F7F1"/>
           </w:tcPr>
           <w:p>
@@ -3409,7 +3684,7 @@
         </w:tc>
         <w:tc>
           <w:tcPr>
-            <w:tcW w:type="dxa" w:w="7416"/>
+            <w:tcW w:type="dxa" w:w="4921"/>
             <w:shd w:val="clear" w:color="auto" w:fill="E6F7F1"/>
           </w:tcPr>
           <w:p>
@@ -3429,7 +3704,7 @@
         </w:tc>
         <w:tc>
           <w:tcPr>
-            <w:tcW w:type="dxa" w:w="1224"/>
+            <w:tcW w:type="dxa" w:w="1219"/>
             <w:shd w:val="clear" w:color="auto" w:fill="E6F7F1"/>
           </w:tcPr>
           <w:p>
@@ -3444,6 +3719,27 @@
                 <w:sz w:val="19"/>
               </w:rPr>
               <w:t>50 min</w:t>
+            </w:r>
+          </w:p>
+        </w:tc>
+        <w:tc>
+          <w:tcPr>
+            <w:tcW w:type="dxa" w:w="1490"/>
+            <w:shd w:val="clear" w:color="auto" w:fill="E6F7F1"/>
+          </w:tcPr>
+          <w:p>
+            <w:pPr>
+              <w:keepLines/>
+            </w:pPr>
+            <w:r>
+              <w:t>91–94</w:t>
+            </w:r>
+            <w:r>
+              <w:rPr>
+                <w:rFonts w:ascii="Arial" w:hAnsi="Arial"/>
+                <w:b w:val="0"/>
+                <w:sz w:val="19"/>
+              </w:rPr>
             </w:r>
           </w:p>
         </w:tc>
@@ -3454,7 +3750,7 @@
         </w:trPr>
         <w:tc>
           <w:tcPr>
-            <w:tcW w:type="dxa" w:w="1656"/>
+            <w:tcW w:type="dxa" w:w="1400"/>
             <w:shd w:val="clear" w:color="auto" w:fill="FDF3E3"/>
           </w:tcPr>
           <w:p>
@@ -3474,7 +3770,7 @@
         </w:tc>
         <w:tc>
           <w:tcPr>
-            <w:tcW w:type="dxa" w:w="7416"/>
+            <w:tcW w:type="dxa" w:w="4921"/>
             <w:shd w:val="clear" w:color="auto" w:fill="FDF3E3"/>
           </w:tcPr>
           <w:p>
@@ -3494,7 +3790,7 @@
         </w:tc>
         <w:tc>
           <w:tcPr>
-            <w:tcW w:type="dxa" w:w="1224"/>
+            <w:tcW w:type="dxa" w:w="1219"/>
             <w:shd w:val="clear" w:color="auto" w:fill="FDF3E3"/>
           </w:tcPr>
           <w:p>
@@ -3509,6 +3805,27 @@
                 <w:sz w:val="19"/>
               </w:rPr>
               <w:t>15 min</w:t>
+            </w:r>
+          </w:p>
+        </w:tc>
+        <w:tc>
+          <w:tcPr>
+            <w:tcW w:type="dxa" w:w="1490"/>
+            <w:shd w:val="clear" w:color="auto" w:fill="FDF3E3"/>
+          </w:tcPr>
+          <w:p>
+            <w:pPr>
+              <w:keepLines/>
+            </w:pPr>
+            <w:r>
+              <w:t>—</w:t>
+            </w:r>
+            <w:r>
+              <w:rPr>
+                <w:rFonts w:ascii="Arial" w:hAnsi="Arial"/>
+                <w:b w:val="0"/>
+                <w:sz w:val="19"/>
+              </w:rPr>
             </w:r>
           </w:p>
         </w:tc>
@@ -3519,7 +3836,7 @@
         </w:trPr>
         <w:tc>
           <w:tcPr>
-            <w:tcW w:type="dxa" w:w="1656"/>
+            <w:tcW w:type="dxa" w:w="1400"/>
             <w:shd w:val="clear" w:color="auto" w:fill="E6F7F1"/>
           </w:tcPr>
           <w:p>
@@ -3539,7 +3856,7 @@
         </w:tc>
         <w:tc>
           <w:tcPr>
-            <w:tcW w:type="dxa" w:w="7416"/>
+            <w:tcW w:type="dxa" w:w="4921"/>
             <w:shd w:val="clear" w:color="auto" w:fill="E6F7F1"/>
           </w:tcPr>
           <w:p>
@@ -3559,7 +3876,7 @@
         </w:tc>
         <w:tc>
           <w:tcPr>
-            <w:tcW w:type="dxa" w:w="1224"/>
+            <w:tcW w:type="dxa" w:w="1219"/>
             <w:shd w:val="clear" w:color="auto" w:fill="E6F7F1"/>
           </w:tcPr>
           <w:p>
@@ -3574,6 +3891,27 @@
                 <w:sz w:val="19"/>
               </w:rPr>
               <w:t>25 min</w:t>
+            </w:r>
+          </w:p>
+        </w:tc>
+        <w:tc>
+          <w:tcPr>
+            <w:tcW w:type="dxa" w:w="1490"/>
+            <w:shd w:val="clear" w:color="auto" w:fill="E6F7F1"/>
+          </w:tcPr>
+          <w:p>
+            <w:pPr>
+              <w:keepLines/>
+            </w:pPr>
+            <w:r>
+              <w:t>95–98</w:t>
+            </w:r>
+            <w:r>
+              <w:rPr>
+                <w:rFonts w:ascii="Arial" w:hAnsi="Arial"/>
+                <w:b w:val="0"/>
+                <w:sz w:val="19"/>
+              </w:rPr>
             </w:r>
           </w:p>
         </w:tc>
@@ -3584,7 +3922,7 @@
         </w:trPr>
         <w:tc>
           <w:tcPr>
-            <w:tcW w:type="dxa" w:w="1656"/>
+            <w:tcW w:type="dxa" w:w="1400"/>
             <w:shd w:val="clear" w:color="auto" w:fill="E6F7F1"/>
           </w:tcPr>
           <w:p>
@@ -3604,7 +3942,7 @@
         </w:tc>
         <w:tc>
           <w:tcPr>
-            <w:tcW w:type="dxa" w:w="7416"/>
+            <w:tcW w:type="dxa" w:w="4921"/>
             <w:shd w:val="clear" w:color="auto" w:fill="E6F7F1"/>
           </w:tcPr>
           <w:p>
@@ -3624,7 +3962,7 @@
         </w:tc>
         <w:tc>
           <w:tcPr>
-            <w:tcW w:type="dxa" w:w="1224"/>
+            <w:tcW w:type="dxa" w:w="1219"/>
             <w:shd w:val="clear" w:color="auto" w:fill="E6F7F1"/>
           </w:tcPr>
           <w:p>
@@ -3639,6 +3977,27 @@
                 <w:sz w:val="19"/>
               </w:rPr>
               <w:t>45 min</w:t>
+            </w:r>
+          </w:p>
+        </w:tc>
+        <w:tc>
+          <w:tcPr>
+            <w:tcW w:type="dxa" w:w="1490"/>
+            <w:shd w:val="clear" w:color="auto" w:fill="E6F7F1"/>
+          </w:tcPr>
+          <w:p>
+            <w:pPr>
+              <w:keepLines/>
+            </w:pPr>
+            <w:r>
+              <w:t>99–113</w:t>
+            </w:r>
+            <w:r>
+              <w:rPr>
+                <w:rFonts w:ascii="Arial" w:hAnsi="Arial"/>
+                <w:b w:val="0"/>
+                <w:sz w:val="19"/>
+              </w:rPr>
             </w:r>
           </w:p>
         </w:tc>
@@ -3649,7 +4008,7 @@
         </w:trPr>
         <w:tc>
           <w:tcPr>
-            <w:tcW w:type="dxa" w:w="1656"/>
+            <w:tcW w:type="dxa" w:w="1400"/>
             <w:shd w:val="clear" w:color="auto" w:fill="E6F7F1"/>
           </w:tcPr>
           <w:p>
@@ -3669,28 +4028,7 @@
         </w:tc>
         <w:tc>
           <w:tcPr>
-            <w:tcW w:type="dxa" w:w="7416"/>
-            <w:shd w:val="clear" w:color="auto" w:fill="E6F7F1"/>
-          </w:tcPr>
-          <w:p>
-            <w:pPr>
-              <w:keepLines/>
-            </w:pPr>
-            <w:r>
-              <w:t>Topic 3: Job impact and redesign — why now (12,000+ agents on AgentSea), the stakes (WEF 2030 projections), the human-owner operating model, the problem of adoption debt, the Human Owner role and the GROW intervention; Activity 6 — coaching role-play simulator (A2)</w:t>
-            </w:r>
-            <w:r>
-              <w:rPr>
-                <w:rFonts w:ascii="Arial" w:hAnsi="Arial"/>
-                <w:b w:val="0"/>
-                <w:sz w:val="19"/>
-              </w:rPr>
-            </w:r>
-          </w:p>
-        </w:tc>
-        <w:tc>
-          <w:tcPr>
-            <w:tcW w:type="dxa" w:w="1224"/>
+            <w:tcW w:type="dxa" w:w="4921"/>
             <w:shd w:val="clear" w:color="auto" w:fill="E6F7F1"/>
           </w:tcPr>
           <w:p>
@@ -3704,7 +4042,48 @@
                 <w:b w:val="0"/>
                 <w:sz w:val="19"/>
               </w:rPr>
+              <w:t>Topic 3: Job impact and redesign — why now (12,000+ agents on AgentSea), the stakes (WEF 2030 projections), the human-owner operating model, the problem of adoption debt, the Human Owner role and the GROW intervention; Activity 6 — coaching role-play simulator (A2)</w:t>
+            </w:r>
+          </w:p>
+        </w:tc>
+        <w:tc>
+          <w:tcPr>
+            <w:tcW w:type="dxa" w:w="1219"/>
+            <w:shd w:val="clear" w:color="auto" w:fill="E6F7F1"/>
+          </w:tcPr>
+          <w:p>
+            <w:pPr>
+              <w:keepLines/>
+            </w:pPr>
+            <w:r/>
+            <w:r>
+              <w:rPr>
+                <w:rFonts w:ascii="Arial" w:hAnsi="Arial"/>
+                <w:b w:val="0"/>
+                <w:sz w:val="19"/>
+              </w:rPr>
               <w:t>40 min</w:t>
+            </w:r>
+          </w:p>
+        </w:tc>
+        <w:tc>
+          <w:tcPr>
+            <w:tcW w:type="dxa" w:w="1490"/>
+            <w:shd w:val="clear" w:color="auto" w:fill="E6F7F1"/>
+          </w:tcPr>
+          <w:p>
+            <w:pPr>
+              <w:keepLines/>
+            </w:pPr>
+            <w:r>
+              <w:t>114–126</w:t>
+            </w:r>
+            <w:r>
+              <w:rPr>
+                <w:rFonts w:ascii="Arial" w:hAnsi="Arial"/>
+                <w:b w:val="0"/>
+                <w:sz w:val="19"/>
+              </w:rPr>
             </w:r>
           </w:p>
         </w:tc>
@@ -3715,7 +4094,7 @@
         </w:trPr>
         <w:tc>
           <w:tcPr>
-            <w:tcW w:type="dxa" w:w="1656"/>
+            <w:tcW w:type="dxa" w:w="1400"/>
             <w:shd w:val="clear" w:color="auto" w:fill="E6F7F1"/>
           </w:tcPr>
           <w:p>
@@ -3735,7 +4114,7 @@
         </w:tc>
         <w:tc>
           <w:tcPr>
-            <w:tcW w:type="dxa" w:w="7416"/>
+            <w:tcW w:type="dxa" w:w="4921"/>
             <w:shd w:val="clear" w:color="auto" w:fill="E6F7F1"/>
           </w:tcPr>
           <w:p>
@@ -3755,7 +4134,7 @@
         </w:tc>
         <w:tc>
           <w:tcPr>
-            <w:tcW w:type="dxa" w:w="1224"/>
+            <w:tcW w:type="dxa" w:w="1219"/>
             <w:shd w:val="clear" w:color="auto" w:fill="E6F7F1"/>
           </w:tcPr>
           <w:p>
@@ -3770,6 +4149,27 @@
                 <w:sz w:val="19"/>
               </w:rPr>
               <w:t>45 min</w:t>
+            </w:r>
+          </w:p>
+        </w:tc>
+        <w:tc>
+          <w:tcPr>
+            <w:tcW w:type="dxa" w:w="1490"/>
+            <w:shd w:val="clear" w:color="auto" w:fill="E6F7F1"/>
+          </w:tcPr>
+          <w:p>
+            <w:pPr>
+              <w:keepLines/>
+            </w:pPr>
+            <w:r>
+              <w:t>127–158</w:t>
+            </w:r>
+            <w:r>
+              <w:rPr>
+                <w:rFonts w:ascii="Arial" w:hAnsi="Arial"/>
+                <w:b w:val="0"/>
+                <w:sz w:val="19"/>
+              </w:rPr>
             </w:r>
           </w:p>
         </w:tc>
@@ -3780,7 +4180,7 @@
         </w:trPr>
         <w:tc>
           <w:tcPr>
-            <w:tcW w:type="dxa" w:w="1656"/>
+            <w:tcW w:type="dxa" w:w="1400"/>
             <w:shd w:val="clear" w:color="auto" w:fill="FDECEC"/>
           </w:tcPr>
           <w:p>
@@ -3800,7 +4200,7 @@
         </w:tc>
         <w:tc>
           <w:tcPr>
-            <w:tcW w:type="dxa" w:w="7416"/>
+            <w:tcW w:type="dxa" w:w="4921"/>
             <w:shd w:val="clear" w:color="auto" w:fill="FDECEC"/>
           </w:tcPr>
           <w:p>
@@ -3820,7 +4220,7 @@
         </w:tc>
         <w:tc>
           <w:tcPr>
-            <w:tcW w:type="dxa" w:w="1224"/>
+            <w:tcW w:type="dxa" w:w="1219"/>
             <w:shd w:val="clear" w:color="auto" w:fill="FDECEC"/>
           </w:tcPr>
           <w:p>
@@ -3835,6 +4235,27 @@
                 <w:sz w:val="19"/>
               </w:rPr>
               <w:t>35 min</w:t>
+            </w:r>
+          </w:p>
+        </w:tc>
+        <w:tc>
+          <w:tcPr>
+            <w:tcW w:type="dxa" w:w="1490"/>
+            <w:shd w:val="clear" w:color="auto" w:fill="FDECEC"/>
+          </w:tcPr>
+          <w:p>
+            <w:pPr>
+              <w:keepLines/>
+            </w:pPr>
+            <w:r>
+              <w:t>159–165</w:t>
+            </w:r>
+            <w:r>
+              <w:rPr>
+                <w:rFonts w:ascii="Arial" w:hAnsi="Arial"/>
+                <w:b w:val="0"/>
+                <w:sz w:val="19"/>
+              </w:rPr>
             </w:r>
           </w:p>
         </w:tc>
@@ -3845,7 +4266,7 @@
         </w:trPr>
         <w:tc>
           <w:tcPr>
-            <w:tcW w:type="dxa" w:w="1656"/>
+            <w:tcW w:type="dxa" w:w="1400"/>
             <w:shd w:val="clear" w:color="auto" w:fill="FDECEC"/>
           </w:tcPr>
           <w:p>
@@ -3865,7 +4286,7 @@
         </w:tc>
         <w:tc>
           <w:tcPr>
-            <w:tcW w:type="dxa" w:w="7416"/>
+            <w:tcW w:type="dxa" w:w="4921"/>
             <w:shd w:val="clear" w:color="auto" w:fill="FDECEC"/>
           </w:tcPr>
           <w:p>
@@ -3885,7 +4306,7 @@
         </w:tc>
         <w:tc>
           <w:tcPr>
-            <w:tcW w:type="dxa" w:w="1224"/>
+            <w:tcW w:type="dxa" w:w="1219"/>
             <w:shd w:val="clear" w:color="auto" w:fill="FDECEC"/>
           </w:tcPr>
           <w:p>
@@ -3900,6 +4321,27 @@
                 <w:sz w:val="19"/>
               </w:rPr>
               <w:t>25 min</w:t>
+            </w:r>
+          </w:p>
+        </w:tc>
+        <w:tc>
+          <w:tcPr>
+            <w:tcW w:type="dxa" w:w="1490"/>
+            <w:shd w:val="clear" w:color="auto" w:fill="FDECEC"/>
+          </w:tcPr>
+          <w:p>
+            <w:pPr>
+              <w:keepLines/>
+            </w:pPr>
+            <w:r>
+              <w:t>166–168</w:t>
+            </w:r>
+            <w:r>
+              <w:rPr>
+                <w:rFonts w:ascii="Arial" w:hAnsi="Arial"/>
+                <w:b w:val="0"/>
+                <w:sz w:val="19"/>
+              </w:rPr>
             </w:r>
           </w:p>
         </w:tc>

</xml_diff>